<commit_message>
Paso a paso de implementación con verificación, también en Word
- docs/PASO_A_PASO.md: 19 pasos con para qué sirve, qué hacer, resultado
  esperado, alternativa si falla y casilla para marcar; pruebas con
  facturas reales, puesta en marcha segura y resultado final.
- docs/Implementacion_y_verificacion_ComprobantePy.docx con la guía de estilo.
- El generador de Word admite configuración por documento, comandos,
  casillas y notas destacadas.
</commit_message>
<xml_diff>
--- a/docs/Manual_de_usuario_ComprobantePy.docx
+++ b/docs/Manual_de_usuario_ComprobantePy.docx
@@ -1758,9 +1758,9 @@
         <w:tblLayout w:type="fixed"/>
       </w:tblPr>
       <w:tblGrid>
-        <w:gridCol w:w="2194"/>
-        <w:gridCol w:w="5756"/>
-        <w:gridCol w:w="4722"/>
+        <w:gridCol w:w="1690"/>
+        <w:gridCol w:w="6034"/>
+        <w:gridCol w:w="4948"/>
       </w:tblGrid>
       <w:tr>
         <w:trPr>
@@ -1769,7 +1769,7 @@
         </w:trPr>
         <w:tc>
           <w:tcPr>
-            <w:tcW w:type="dxa" w:w="2194"/>
+            <w:tcW w:type="dxa" w:w="1690"/>
             <w:tcBorders>
               <w:top w:val="single" w:color="C9C7D6" w:sz="4"/>
               <w:left w:val="single" w:color="C9C7D6" w:sz="4"/>
@@ -1788,6 +1788,7 @@
           <w:p>
             <w:pPr>
               <w:spacing w:after="0" w:before="0"/>
+              <w:jc w:val="left"/>
             </w:pPr>
             <w:r>
               <w:rPr>
@@ -1804,7 +1805,7 @@
         </w:tc>
         <w:tc>
           <w:tcPr>
-            <w:tcW w:type="dxa" w:w="5756"/>
+            <w:tcW w:type="dxa" w:w="6034"/>
             <w:tcBorders>
               <w:top w:val="single" w:color="C9C7D6" w:sz="4"/>
               <w:left w:val="single" w:color="C9C7D6" w:sz="4"/>
@@ -1823,6 +1824,7 @@
           <w:p>
             <w:pPr>
               <w:spacing w:after="0" w:before="0"/>
+              <w:jc w:val="left"/>
             </w:pPr>
             <w:r>
               <w:rPr>
@@ -1839,7 +1841,7 @@
         </w:tc>
         <w:tc>
           <w:tcPr>
-            <w:tcW w:type="dxa" w:w="4722"/>
+            <w:tcW w:type="dxa" w:w="4948"/>
             <w:tcBorders>
               <w:top w:val="single" w:color="C9C7D6" w:sz="4"/>
               <w:left w:val="single" w:color="C9C7D6" w:sz="4"/>
@@ -1858,6 +1860,7 @@
           <w:p>
             <w:pPr>
               <w:spacing w:after="0" w:before="0"/>
+              <w:jc w:val="left"/>
             </w:pPr>
             <w:r>
               <w:rPr>
@@ -1880,7 +1883,7 @@
         </w:trPr>
         <w:tc>
           <w:tcPr>
-            <w:tcW w:type="dxa" w:w="2194"/>
+            <w:tcW w:type="dxa" w:w="1690"/>
             <w:tcBorders>
               <w:top w:val="single" w:color="C9C7D6" w:sz="4"/>
               <w:left w:val="single" w:color="C9C7D6" w:sz="4"/>
@@ -1899,6 +1902,7 @@
           <w:p>
             <w:pPr>
               <w:spacing w:after="0" w:before="0"/>
+              <w:jc w:val="left"/>
             </w:pPr>
             <w:r>
               <w:rPr>
@@ -1915,7 +1919,7 @@
         </w:tc>
         <w:tc>
           <w:tcPr>
-            <w:tcW w:type="dxa" w:w="5756"/>
+            <w:tcW w:type="dxa" w:w="6034"/>
             <w:tcBorders>
               <w:top w:val="single" w:color="C9C7D6" w:sz="4"/>
               <w:left w:val="single" w:color="C9C7D6" w:sz="4"/>
@@ -1934,6 +1938,7 @@
           <w:p>
             <w:pPr>
               <w:spacing w:after="0" w:before="0"/>
+              <w:jc w:val="left"/>
             </w:pPr>
             <w:r>
               <w:rPr>
@@ -1948,7 +1953,7 @@
         </w:tc>
         <w:tc>
           <w:tcPr>
-            <w:tcW w:type="dxa" w:w="4722"/>
+            <w:tcW w:type="dxa" w:w="4948"/>
             <w:tcBorders>
               <w:top w:val="single" w:color="C9C7D6" w:sz="4"/>
               <w:left w:val="single" w:color="C9C7D6" w:sz="4"/>
@@ -1967,6 +1972,7 @@
           <w:p>
             <w:pPr>
               <w:spacing w:after="0" w:before="0"/>
+              <w:jc w:val="left"/>
             </w:pPr>
             <w:r>
               <w:rPr>
@@ -1987,7 +1993,7 @@
         </w:trPr>
         <w:tc>
           <w:tcPr>
-            <w:tcW w:type="dxa" w:w="2194"/>
+            <w:tcW w:type="dxa" w:w="1690"/>
             <w:tcBorders>
               <w:top w:val="single" w:color="C9C7D6" w:sz="4"/>
               <w:left w:val="single" w:color="C9C7D6" w:sz="4"/>
@@ -2006,6 +2012,7 @@
           <w:p>
             <w:pPr>
               <w:spacing w:after="0" w:before="0"/>
+              <w:jc w:val="left"/>
             </w:pPr>
             <w:r>
               <w:rPr>
@@ -2022,7 +2029,7 @@
         </w:tc>
         <w:tc>
           <w:tcPr>
-            <w:tcW w:type="dxa" w:w="5756"/>
+            <w:tcW w:type="dxa" w:w="6034"/>
             <w:tcBorders>
               <w:top w:val="single" w:color="C9C7D6" w:sz="4"/>
               <w:left w:val="single" w:color="C9C7D6" w:sz="4"/>
@@ -2041,6 +2048,7 @@
           <w:p>
             <w:pPr>
               <w:spacing w:after="0" w:before="0"/>
+              <w:jc w:val="left"/>
             </w:pPr>
             <w:r>
               <w:rPr>
@@ -2055,7 +2063,7 @@
         </w:tc>
         <w:tc>
           <w:tcPr>
-            <w:tcW w:type="dxa" w:w="4722"/>
+            <w:tcW w:type="dxa" w:w="4948"/>
             <w:tcBorders>
               <w:top w:val="single" w:color="C9C7D6" w:sz="4"/>
               <w:left w:val="single" w:color="C9C7D6" w:sz="4"/>
@@ -2074,6 +2082,7 @@
           <w:p>
             <w:pPr>
               <w:spacing w:after="0" w:before="0"/>
+              <w:jc w:val="left"/>
             </w:pPr>
             <w:r>
               <w:rPr>
@@ -2094,7 +2103,7 @@
         </w:trPr>
         <w:tc>
           <w:tcPr>
-            <w:tcW w:type="dxa" w:w="2194"/>
+            <w:tcW w:type="dxa" w:w="1690"/>
             <w:tcBorders>
               <w:top w:val="single" w:color="C9C7D6" w:sz="4"/>
               <w:left w:val="single" w:color="C9C7D6" w:sz="4"/>
@@ -2113,6 +2122,7 @@
           <w:p>
             <w:pPr>
               <w:spacing w:after="0" w:before="0"/>
+              <w:jc w:val="left"/>
             </w:pPr>
             <w:r>
               <w:rPr>
@@ -2129,7 +2139,7 @@
         </w:tc>
         <w:tc>
           <w:tcPr>
-            <w:tcW w:type="dxa" w:w="5756"/>
+            <w:tcW w:type="dxa" w:w="6034"/>
             <w:tcBorders>
               <w:top w:val="single" w:color="C9C7D6" w:sz="4"/>
               <w:left w:val="single" w:color="C9C7D6" w:sz="4"/>
@@ -2148,6 +2158,7 @@
           <w:p>
             <w:pPr>
               <w:spacing w:after="0" w:before="0"/>
+              <w:jc w:val="left"/>
             </w:pPr>
             <w:r>
               <w:rPr>
@@ -2162,7 +2173,7 @@
         </w:tc>
         <w:tc>
           <w:tcPr>
-            <w:tcW w:type="dxa" w:w="4722"/>
+            <w:tcW w:type="dxa" w:w="4948"/>
             <w:tcBorders>
               <w:top w:val="single" w:color="C9C7D6" w:sz="4"/>
               <w:left w:val="single" w:color="C9C7D6" w:sz="4"/>
@@ -2181,6 +2192,7 @@
           <w:p>
             <w:pPr>
               <w:spacing w:after="0" w:before="0"/>
+              <w:jc w:val="left"/>
             </w:pPr>
             <w:r>
               <w:rPr>
@@ -2201,7 +2213,7 @@
         </w:trPr>
         <w:tc>
           <w:tcPr>
-            <w:tcW w:type="dxa" w:w="2194"/>
+            <w:tcW w:type="dxa" w:w="1690"/>
             <w:tcBorders>
               <w:top w:val="single" w:color="C9C7D6" w:sz="4"/>
               <w:left w:val="single" w:color="C9C7D6" w:sz="4"/>
@@ -2220,6 +2232,7 @@
           <w:p>
             <w:pPr>
               <w:spacing w:after="0" w:before="0"/>
+              <w:jc w:val="left"/>
             </w:pPr>
             <w:r>
               <w:rPr>
@@ -2236,7 +2249,7 @@
         </w:tc>
         <w:tc>
           <w:tcPr>
-            <w:tcW w:type="dxa" w:w="5756"/>
+            <w:tcW w:type="dxa" w:w="6034"/>
             <w:tcBorders>
               <w:top w:val="single" w:color="C9C7D6" w:sz="4"/>
               <w:left w:val="single" w:color="C9C7D6" w:sz="4"/>
@@ -2255,6 +2268,7 @@
           <w:p>
             <w:pPr>
               <w:spacing w:after="0" w:before="0"/>
+              <w:jc w:val="left"/>
             </w:pPr>
             <w:r>
               <w:rPr>
@@ -2269,7 +2283,7 @@
         </w:tc>
         <w:tc>
           <w:tcPr>
-            <w:tcW w:type="dxa" w:w="4722"/>
+            <w:tcW w:type="dxa" w:w="4948"/>
             <w:tcBorders>
               <w:top w:val="single" w:color="C9C7D6" w:sz="4"/>
               <w:left w:val="single" w:color="C9C7D6" w:sz="4"/>
@@ -2288,6 +2302,7 @@
           <w:p>
             <w:pPr>
               <w:spacing w:after="0" w:before="0"/>
+              <w:jc w:val="left"/>
             </w:pPr>
             <w:r>
               <w:rPr>
@@ -2308,7 +2323,7 @@
         </w:trPr>
         <w:tc>
           <w:tcPr>
-            <w:tcW w:type="dxa" w:w="2194"/>
+            <w:tcW w:type="dxa" w:w="1690"/>
             <w:tcBorders>
               <w:top w:val="single" w:color="C9C7D6" w:sz="4"/>
               <w:left w:val="single" w:color="C9C7D6" w:sz="4"/>
@@ -2327,6 +2342,7 @@
           <w:p>
             <w:pPr>
               <w:spacing w:after="0" w:before="0"/>
+              <w:jc w:val="left"/>
             </w:pPr>
             <w:r>
               <w:rPr>
@@ -2343,7 +2359,7 @@
         </w:tc>
         <w:tc>
           <w:tcPr>
-            <w:tcW w:type="dxa" w:w="5756"/>
+            <w:tcW w:type="dxa" w:w="6034"/>
             <w:tcBorders>
               <w:top w:val="single" w:color="C9C7D6" w:sz="4"/>
               <w:left w:val="single" w:color="C9C7D6" w:sz="4"/>
@@ -2362,6 +2378,7 @@
           <w:p>
             <w:pPr>
               <w:spacing w:after="0" w:before="0"/>
+              <w:jc w:val="left"/>
             </w:pPr>
             <w:r>
               <w:rPr>
@@ -2376,7 +2393,7 @@
         </w:tc>
         <w:tc>
           <w:tcPr>
-            <w:tcW w:type="dxa" w:w="4722"/>
+            <w:tcW w:type="dxa" w:w="4948"/>
             <w:tcBorders>
               <w:top w:val="single" w:color="C9C7D6" w:sz="4"/>
               <w:left w:val="single" w:color="C9C7D6" w:sz="4"/>
@@ -2395,6 +2412,7 @@
           <w:p>
             <w:pPr>
               <w:spacing w:after="0" w:before="0"/>
+              <w:jc w:val="left"/>
             </w:pPr>
             <w:r>
               <w:rPr>
@@ -2415,7 +2433,7 @@
         </w:trPr>
         <w:tc>
           <w:tcPr>
-            <w:tcW w:type="dxa" w:w="2194"/>
+            <w:tcW w:type="dxa" w:w="1690"/>
             <w:tcBorders>
               <w:top w:val="single" w:color="C9C7D6" w:sz="4"/>
               <w:left w:val="single" w:color="C9C7D6" w:sz="4"/>
@@ -2434,6 +2452,7 @@
           <w:p>
             <w:pPr>
               <w:spacing w:after="0" w:before="0"/>
+              <w:jc w:val="left"/>
             </w:pPr>
             <w:r>
               <w:rPr>
@@ -2450,7 +2469,7 @@
         </w:tc>
         <w:tc>
           <w:tcPr>
-            <w:tcW w:type="dxa" w:w="5756"/>
+            <w:tcW w:type="dxa" w:w="6034"/>
             <w:tcBorders>
               <w:top w:val="single" w:color="C9C7D6" w:sz="4"/>
               <w:left w:val="single" w:color="C9C7D6" w:sz="4"/>
@@ -2469,6 +2488,7 @@
           <w:p>
             <w:pPr>
               <w:spacing w:after="0" w:before="0"/>
+              <w:jc w:val="left"/>
             </w:pPr>
             <w:r>
               <w:rPr>
@@ -2483,7 +2503,7 @@
         </w:tc>
         <w:tc>
           <w:tcPr>
-            <w:tcW w:type="dxa" w:w="4722"/>
+            <w:tcW w:type="dxa" w:w="4948"/>
             <w:tcBorders>
               <w:top w:val="single" w:color="C9C7D6" w:sz="4"/>
               <w:left w:val="single" w:color="C9C7D6" w:sz="4"/>
@@ -2502,6 +2522,7 @@
           <w:p>
             <w:pPr>
               <w:spacing w:after="0" w:before="0"/>
+              <w:jc w:val="left"/>
             </w:pPr>
             <w:r>
               <w:rPr>
@@ -2522,7 +2543,7 @@
         </w:trPr>
         <w:tc>
           <w:tcPr>
-            <w:tcW w:type="dxa" w:w="2194"/>
+            <w:tcW w:type="dxa" w:w="1690"/>
             <w:tcBorders>
               <w:top w:val="single" w:color="C9C7D6" w:sz="4"/>
               <w:left w:val="single" w:color="C9C7D6" w:sz="4"/>
@@ -2541,6 +2562,7 @@
           <w:p>
             <w:pPr>
               <w:spacing w:after="0" w:before="0"/>
+              <w:jc w:val="left"/>
             </w:pPr>
             <w:r>
               <w:rPr>
@@ -2557,7 +2579,7 @@
         </w:tc>
         <w:tc>
           <w:tcPr>
-            <w:tcW w:type="dxa" w:w="5756"/>
+            <w:tcW w:type="dxa" w:w="6034"/>
             <w:tcBorders>
               <w:top w:val="single" w:color="C9C7D6" w:sz="4"/>
               <w:left w:val="single" w:color="C9C7D6" w:sz="4"/>
@@ -2576,6 +2598,7 @@
           <w:p>
             <w:pPr>
               <w:spacing w:after="0" w:before="0"/>
+              <w:jc w:val="left"/>
             </w:pPr>
             <w:r>
               <w:rPr>
@@ -2590,7 +2613,7 @@
         </w:tc>
         <w:tc>
           <w:tcPr>
-            <w:tcW w:type="dxa" w:w="4722"/>
+            <w:tcW w:type="dxa" w:w="4948"/>
             <w:tcBorders>
               <w:top w:val="single" w:color="C9C7D6" w:sz="4"/>
               <w:left w:val="single" w:color="C9C7D6" w:sz="4"/>
@@ -2609,6 +2632,7 @@
           <w:p>
             <w:pPr>
               <w:spacing w:after="0" w:before="0"/>
+              <w:jc w:val="left"/>
             </w:pPr>
             <w:r>
               <w:rPr>
@@ -2629,7 +2653,7 @@
         </w:trPr>
         <w:tc>
           <w:tcPr>
-            <w:tcW w:type="dxa" w:w="2194"/>
+            <w:tcW w:type="dxa" w:w="1690"/>
             <w:tcBorders>
               <w:top w:val="single" w:color="C9C7D6" w:sz="4"/>
               <w:left w:val="single" w:color="C9C7D6" w:sz="4"/>
@@ -2648,6 +2672,7 @@
           <w:p>
             <w:pPr>
               <w:spacing w:after="0" w:before="0"/>
+              <w:jc w:val="left"/>
             </w:pPr>
             <w:r>
               <w:rPr>
@@ -2664,7 +2689,7 @@
         </w:tc>
         <w:tc>
           <w:tcPr>
-            <w:tcW w:type="dxa" w:w="5756"/>
+            <w:tcW w:type="dxa" w:w="6034"/>
             <w:tcBorders>
               <w:top w:val="single" w:color="C9C7D6" w:sz="4"/>
               <w:left w:val="single" w:color="C9C7D6" w:sz="4"/>
@@ -2683,6 +2708,7 @@
           <w:p>
             <w:pPr>
               <w:spacing w:after="0" w:before="0"/>
+              <w:jc w:val="left"/>
             </w:pPr>
             <w:r>
               <w:rPr>
@@ -2697,7 +2723,7 @@
         </w:tc>
         <w:tc>
           <w:tcPr>
-            <w:tcW w:type="dxa" w:w="4722"/>
+            <w:tcW w:type="dxa" w:w="4948"/>
             <w:tcBorders>
               <w:top w:val="single" w:color="C9C7D6" w:sz="4"/>
               <w:left w:val="single" w:color="C9C7D6" w:sz="4"/>
@@ -2716,6 +2742,7 @@
           <w:p>
             <w:pPr>
               <w:spacing w:after="0" w:before="0"/>
+              <w:jc w:val="left"/>
             </w:pPr>
             <w:r>
               <w:rPr>
@@ -2736,7 +2763,7 @@
         </w:trPr>
         <w:tc>
           <w:tcPr>
-            <w:tcW w:type="dxa" w:w="2194"/>
+            <w:tcW w:type="dxa" w:w="1690"/>
             <w:tcBorders>
               <w:top w:val="single" w:color="C9C7D6" w:sz="4"/>
               <w:left w:val="single" w:color="C9C7D6" w:sz="4"/>
@@ -2755,6 +2782,7 @@
           <w:p>
             <w:pPr>
               <w:spacing w:after="0" w:before="0"/>
+              <w:jc w:val="left"/>
             </w:pPr>
             <w:r>
               <w:rPr>
@@ -2771,7 +2799,7 @@
         </w:tc>
         <w:tc>
           <w:tcPr>
-            <w:tcW w:type="dxa" w:w="5756"/>
+            <w:tcW w:type="dxa" w:w="6034"/>
             <w:tcBorders>
               <w:top w:val="single" w:color="C9C7D6" w:sz="4"/>
               <w:left w:val="single" w:color="C9C7D6" w:sz="4"/>
@@ -2790,6 +2818,7 @@
           <w:p>
             <w:pPr>
               <w:spacing w:after="0" w:before="0"/>
+              <w:jc w:val="left"/>
             </w:pPr>
             <w:r>
               <w:rPr>
@@ -2804,7 +2833,7 @@
         </w:tc>
         <w:tc>
           <w:tcPr>
-            <w:tcW w:type="dxa" w:w="4722"/>
+            <w:tcW w:type="dxa" w:w="4948"/>
             <w:tcBorders>
               <w:top w:val="single" w:color="C9C7D6" w:sz="4"/>
               <w:left w:val="single" w:color="C9C7D6" w:sz="4"/>
@@ -2823,6 +2852,7 @@
           <w:p>
             <w:pPr>
               <w:spacing w:after="0" w:before="0"/>
+              <w:jc w:val="left"/>
             </w:pPr>
             <w:r>
               <w:rPr>
@@ -2843,7 +2873,7 @@
         </w:trPr>
         <w:tc>
           <w:tcPr>
-            <w:tcW w:type="dxa" w:w="2194"/>
+            <w:tcW w:type="dxa" w:w="1690"/>
             <w:tcBorders>
               <w:top w:val="single" w:color="C9C7D6" w:sz="4"/>
               <w:left w:val="single" w:color="C9C7D6" w:sz="4"/>
@@ -2862,6 +2892,7 @@
           <w:p>
             <w:pPr>
               <w:spacing w:after="0" w:before="0"/>
+              <w:jc w:val="left"/>
             </w:pPr>
             <w:r>
               <w:rPr>
@@ -2878,7 +2909,7 @@
         </w:tc>
         <w:tc>
           <w:tcPr>
-            <w:tcW w:type="dxa" w:w="5756"/>
+            <w:tcW w:type="dxa" w:w="6034"/>
             <w:tcBorders>
               <w:top w:val="single" w:color="C9C7D6" w:sz="4"/>
               <w:left w:val="single" w:color="C9C7D6" w:sz="4"/>
@@ -2897,6 +2928,7 @@
           <w:p>
             <w:pPr>
               <w:spacing w:after="0" w:before="0"/>
+              <w:jc w:val="left"/>
             </w:pPr>
             <w:r>
               <w:rPr>
@@ -2911,7 +2943,7 @@
         </w:tc>
         <w:tc>
           <w:tcPr>
-            <w:tcW w:type="dxa" w:w="4722"/>
+            <w:tcW w:type="dxa" w:w="4948"/>
             <w:tcBorders>
               <w:top w:val="single" w:color="C9C7D6" w:sz="4"/>
               <w:left w:val="single" w:color="C9C7D6" w:sz="4"/>
@@ -2930,6 +2962,7 @@
           <w:p>
             <w:pPr>
               <w:spacing w:after="0" w:before="0"/>
+              <w:jc w:val="left"/>
             </w:pPr>
             <w:r>
               <w:rPr>
@@ -4581,8 +4614,8 @@
         <w:tblLayout w:type="fixed"/>
       </w:tblPr>
       <w:tblGrid>
-        <w:gridCol w:w="2162"/>
-        <w:gridCol w:w="10510"/>
+        <w:gridCol w:w="1499"/>
+        <w:gridCol w:w="11173"/>
       </w:tblGrid>
       <w:tr>
         <w:trPr>
@@ -4591,7 +4624,7 @@
         </w:trPr>
         <w:tc>
           <w:tcPr>
-            <w:tcW w:type="dxa" w:w="2162"/>
+            <w:tcW w:type="dxa" w:w="1499"/>
             <w:tcBorders>
               <w:top w:val="single" w:color="C9C7D6" w:sz="4"/>
               <w:left w:val="single" w:color="C9C7D6" w:sz="4"/>
@@ -4610,6 +4643,7 @@
           <w:p>
             <w:pPr>
               <w:spacing w:after="0" w:before="0"/>
+              <w:jc w:val="left"/>
             </w:pPr>
             <w:r>
               <w:rPr>
@@ -4626,7 +4660,7 @@
         </w:tc>
         <w:tc>
           <w:tcPr>
-            <w:tcW w:type="dxa" w:w="10510"/>
+            <w:tcW w:type="dxa" w:w="11173"/>
             <w:tcBorders>
               <w:top w:val="single" w:color="C9C7D6" w:sz="4"/>
               <w:left w:val="single" w:color="C9C7D6" w:sz="4"/>
@@ -4645,6 +4679,7 @@
           <w:p>
             <w:pPr>
               <w:spacing w:after="0" w:before="0"/>
+              <w:jc w:val="left"/>
             </w:pPr>
             <w:r>
               <w:rPr>
@@ -4667,7 +4702,7 @@
         </w:trPr>
         <w:tc>
           <w:tcPr>
-            <w:tcW w:type="dxa" w:w="2162"/>
+            <w:tcW w:type="dxa" w:w="1499"/>
             <w:tcBorders>
               <w:top w:val="single" w:color="C9C7D6" w:sz="4"/>
               <w:left w:val="single" w:color="C9C7D6" w:sz="4"/>
@@ -4686,6 +4721,7 @@
           <w:p>
             <w:pPr>
               <w:spacing w:after="0" w:before="0"/>
+              <w:jc w:val="left"/>
             </w:pPr>
             <w:r>
               <w:rPr>
@@ -4702,7 +4738,7 @@
         </w:tc>
         <w:tc>
           <w:tcPr>
-            <w:tcW w:type="dxa" w:w="10510"/>
+            <w:tcW w:type="dxa" w:w="11173"/>
             <w:tcBorders>
               <w:top w:val="single" w:color="C9C7D6" w:sz="4"/>
               <w:left w:val="single" w:color="C9C7D6" w:sz="4"/>
@@ -4721,6 +4757,7 @@
           <w:p>
             <w:pPr>
               <w:spacing w:after="0" w:before="0"/>
+              <w:jc w:val="left"/>
             </w:pPr>
             <w:r>
               <w:rPr>
@@ -4772,7 +4809,7 @@
         </w:trPr>
         <w:tc>
           <w:tcPr>
-            <w:tcW w:type="dxa" w:w="2162"/>
+            <w:tcW w:type="dxa" w:w="1499"/>
             <w:tcBorders>
               <w:top w:val="single" w:color="C9C7D6" w:sz="4"/>
               <w:left w:val="single" w:color="C9C7D6" w:sz="4"/>
@@ -4791,6 +4828,7 @@
           <w:p>
             <w:pPr>
               <w:spacing w:after="0" w:before="0"/>
+              <w:jc w:val="left"/>
             </w:pPr>
             <w:r>
               <w:rPr>
@@ -4807,7 +4845,7 @@
         </w:tc>
         <w:tc>
           <w:tcPr>
-            <w:tcW w:type="dxa" w:w="10510"/>
+            <w:tcW w:type="dxa" w:w="11173"/>
             <w:tcBorders>
               <w:top w:val="single" w:color="C9C7D6" w:sz="4"/>
               <w:left w:val="single" w:color="C9C7D6" w:sz="4"/>
@@ -4826,6 +4864,7 @@
           <w:p>
             <w:pPr>
               <w:spacing w:after="0" w:before="0"/>
+              <w:jc w:val="left"/>
             </w:pPr>
             <w:r>
               <w:rPr>
@@ -4846,7 +4885,7 @@
         </w:trPr>
         <w:tc>
           <w:tcPr>
-            <w:tcW w:type="dxa" w:w="2162"/>
+            <w:tcW w:type="dxa" w:w="1499"/>
             <w:tcBorders>
               <w:top w:val="single" w:color="C9C7D6" w:sz="4"/>
               <w:left w:val="single" w:color="C9C7D6" w:sz="4"/>
@@ -4865,6 +4904,7 @@
           <w:p>
             <w:pPr>
               <w:spacing w:after="0" w:before="0"/>
+              <w:jc w:val="left"/>
             </w:pPr>
             <w:r>
               <w:rPr>
@@ -4881,7 +4921,7 @@
         </w:tc>
         <w:tc>
           <w:tcPr>
-            <w:tcW w:type="dxa" w:w="10510"/>
+            <w:tcW w:type="dxa" w:w="11173"/>
             <w:tcBorders>
               <w:top w:val="single" w:color="C9C7D6" w:sz="4"/>
               <w:left w:val="single" w:color="C9C7D6" w:sz="4"/>
@@ -4900,6 +4940,7 @@
           <w:p>
             <w:pPr>
               <w:spacing w:after="0" w:before="0"/>
+              <w:jc w:val="left"/>
             </w:pPr>
             <w:r>
               <w:rPr>
@@ -4920,7 +4961,7 @@
         </w:trPr>
         <w:tc>
           <w:tcPr>
-            <w:tcW w:type="dxa" w:w="2162"/>
+            <w:tcW w:type="dxa" w:w="1499"/>
             <w:tcBorders>
               <w:top w:val="single" w:color="C9C7D6" w:sz="4"/>
               <w:left w:val="single" w:color="C9C7D6" w:sz="4"/>
@@ -4939,6 +4980,7 @@
           <w:p>
             <w:pPr>
               <w:spacing w:after="0" w:before="0"/>
+              <w:jc w:val="left"/>
             </w:pPr>
             <w:r>
               <w:rPr>
@@ -4955,7 +4997,7 @@
         </w:tc>
         <w:tc>
           <w:tcPr>
-            <w:tcW w:type="dxa" w:w="10510"/>
+            <w:tcW w:type="dxa" w:w="11173"/>
             <w:tcBorders>
               <w:top w:val="single" w:color="C9C7D6" w:sz="4"/>
               <w:left w:val="single" w:color="C9C7D6" w:sz="4"/>
@@ -4974,6 +5016,7 @@
           <w:p>
             <w:pPr>
               <w:spacing w:after="0" w:before="0"/>
+              <w:jc w:val="left"/>
             </w:pPr>
             <w:r>
               <w:rPr>
@@ -4994,7 +5037,7 @@
         </w:trPr>
         <w:tc>
           <w:tcPr>
-            <w:tcW w:type="dxa" w:w="2162"/>
+            <w:tcW w:type="dxa" w:w="1499"/>
             <w:tcBorders>
               <w:top w:val="single" w:color="C9C7D6" w:sz="4"/>
               <w:left w:val="single" w:color="C9C7D6" w:sz="4"/>
@@ -5013,6 +5056,7 @@
           <w:p>
             <w:pPr>
               <w:spacing w:after="0" w:before="0"/>
+              <w:jc w:val="left"/>
             </w:pPr>
             <w:r>
               <w:rPr>
@@ -5029,7 +5073,7 @@
         </w:tc>
         <w:tc>
           <w:tcPr>
-            <w:tcW w:type="dxa" w:w="10510"/>
+            <w:tcW w:type="dxa" w:w="11173"/>
             <w:tcBorders>
               <w:top w:val="single" w:color="C9C7D6" w:sz="4"/>
               <w:left w:val="single" w:color="C9C7D6" w:sz="4"/>
@@ -5048,6 +5092,7 @@
           <w:p>
             <w:pPr>
               <w:spacing w:after="0" w:before="0"/>
+              <w:jc w:val="left"/>
             </w:pPr>
             <w:r>
               <w:rPr>
@@ -5068,7 +5113,7 @@
         </w:trPr>
         <w:tc>
           <w:tcPr>
-            <w:tcW w:type="dxa" w:w="2162"/>
+            <w:tcW w:type="dxa" w:w="1499"/>
             <w:tcBorders>
               <w:top w:val="single" w:color="C9C7D6" w:sz="4"/>
               <w:left w:val="single" w:color="C9C7D6" w:sz="4"/>
@@ -5087,6 +5132,7 @@
           <w:p>
             <w:pPr>
               <w:spacing w:after="0" w:before="0"/>
+              <w:jc w:val="left"/>
             </w:pPr>
             <w:r>
               <w:rPr>
@@ -5103,7 +5149,7 @@
         </w:tc>
         <w:tc>
           <w:tcPr>
-            <w:tcW w:type="dxa" w:w="10510"/>
+            <w:tcW w:type="dxa" w:w="11173"/>
             <w:tcBorders>
               <w:top w:val="single" w:color="C9C7D6" w:sz="4"/>
               <w:left w:val="single" w:color="C9C7D6" w:sz="4"/>
@@ -5122,6 +5168,7 @@
           <w:p>
             <w:pPr>
               <w:spacing w:after="0" w:before="0"/>
+              <w:jc w:val="left"/>
             </w:pPr>
             <w:r>
               <w:rPr>
@@ -6077,6 +6124,7 @@
           <w:p>
             <w:pPr>
               <w:spacing w:after="0" w:before="0"/>
+              <w:jc w:val="left"/>
             </w:pPr>
             <w:r>
               <w:rPr>
@@ -6112,6 +6160,7 @@
           <w:p>
             <w:pPr>
               <w:spacing w:after="0" w:before="0"/>
+              <w:jc w:val="left"/>
             </w:pPr>
             <w:r>
               <w:rPr>
@@ -6147,6 +6196,7 @@
           <w:p>
             <w:pPr>
               <w:spacing w:after="0" w:before="0"/>
+              <w:jc w:val="left"/>
             </w:pPr>
             <w:r>
               <w:rPr>
@@ -6188,6 +6238,7 @@
           <w:p>
             <w:pPr>
               <w:spacing w:after="0" w:before="0"/>
+              <w:jc w:val="left"/>
             </w:pPr>
             <w:r>
               <w:rPr>
@@ -6223,6 +6274,7 @@
           <w:p>
             <w:pPr>
               <w:spacing w:after="0" w:before="0"/>
+              <w:jc w:val="left"/>
             </w:pPr>
             <w:r>
               <w:rPr>
@@ -6256,6 +6308,7 @@
           <w:p>
             <w:pPr>
               <w:spacing w:after="0" w:before="0"/>
+              <w:jc w:val="left"/>
             </w:pPr>
             <w:r>
               <w:rPr>
@@ -6295,6 +6348,7 @@
           <w:p>
             <w:pPr>
               <w:spacing w:after="0" w:before="0"/>
+              <w:jc w:val="left"/>
             </w:pPr>
             <w:r>
               <w:rPr>
@@ -6330,6 +6384,7 @@
           <w:p>
             <w:pPr>
               <w:spacing w:after="0" w:before="0"/>
+              <w:jc w:val="left"/>
             </w:pPr>
             <w:r>
               <w:rPr>
@@ -6363,6 +6418,7 @@
           <w:p>
             <w:pPr>
               <w:spacing w:after="0" w:before="0"/>
+              <w:jc w:val="left"/>
             </w:pPr>
             <w:r>
               <w:rPr>
@@ -6402,6 +6458,7 @@
           <w:p>
             <w:pPr>
               <w:spacing w:after="0" w:before="0"/>
+              <w:jc w:val="left"/>
             </w:pPr>
             <w:r>
               <w:rPr>
@@ -6437,6 +6494,7 @@
           <w:p>
             <w:pPr>
               <w:spacing w:after="0" w:before="0"/>
+              <w:jc w:val="left"/>
             </w:pPr>
             <w:r>
               <w:rPr>
@@ -6470,6 +6528,7 @@
           <w:p>
             <w:pPr>
               <w:spacing w:after="0" w:before="0"/>
+              <w:jc w:val="left"/>
             </w:pPr>
             <w:r>
               <w:rPr>
@@ -6509,6 +6568,7 @@
           <w:p>
             <w:pPr>
               <w:spacing w:after="0" w:before="0"/>
+              <w:jc w:val="left"/>
             </w:pPr>
             <w:r>
               <w:rPr>
@@ -6544,6 +6604,7 @@
           <w:p>
             <w:pPr>
               <w:spacing w:after="0" w:before="0"/>
+              <w:jc w:val="left"/>
             </w:pPr>
             <w:r>
               <w:rPr>
@@ -6577,6 +6638,7 @@
           <w:p>
             <w:pPr>
               <w:spacing w:after="0" w:before="0"/>
+              <w:jc w:val="left"/>
             </w:pPr>
             <w:r>
               <w:rPr>
@@ -6616,6 +6678,7 @@
           <w:p>
             <w:pPr>
               <w:spacing w:after="0" w:before="0"/>
+              <w:jc w:val="left"/>
             </w:pPr>
             <w:r>
               <w:rPr>
@@ -6651,6 +6714,7 @@
           <w:p>
             <w:pPr>
               <w:spacing w:after="0" w:before="0"/>
+              <w:jc w:val="left"/>
             </w:pPr>
             <w:r>
               <w:rPr>
@@ -6684,6 +6748,7 @@
           <w:p>
             <w:pPr>
               <w:spacing w:after="0" w:before="0"/>
+              <w:jc w:val="left"/>
             </w:pPr>
             <w:r>
               <w:rPr>
@@ -6734,6 +6799,7 @@
           <w:p>
             <w:pPr>
               <w:spacing w:after="0" w:before="0"/>
+              <w:jc w:val="left"/>
             </w:pPr>
             <w:r>
               <w:rPr>
@@ -6769,6 +6835,7 @@
           <w:p>
             <w:pPr>
               <w:spacing w:after="0" w:before="0"/>
+              <w:jc w:val="left"/>
             </w:pPr>
             <w:r>
               <w:rPr>
@@ -6802,6 +6869,7 @@
           <w:p>
             <w:pPr>
               <w:spacing w:after="0" w:before="0"/>
+              <w:jc w:val="left"/>
             </w:pPr>
             <w:r>
               <w:rPr>
@@ -6852,6 +6920,7 @@
           <w:p>
             <w:pPr>
               <w:spacing w:after="0" w:before="0"/>
+              <w:jc w:val="left"/>
             </w:pPr>
             <w:r>
               <w:rPr>
@@ -6887,6 +6956,7 @@
           <w:p>
             <w:pPr>
               <w:spacing w:after="0" w:before="0"/>
+              <w:jc w:val="left"/>
             </w:pPr>
             <w:r>
               <w:rPr>
@@ -6920,6 +6990,7 @@
           <w:p>
             <w:pPr>
               <w:spacing w:after="0" w:before="0"/>
+              <w:jc w:val="left"/>
             </w:pPr>
             <w:r>
               <w:rPr>
@@ -6959,6 +7030,7 @@
           <w:p>
             <w:pPr>
               <w:spacing w:after="0" w:before="0"/>
+              <w:jc w:val="left"/>
             </w:pPr>
             <w:r>
               <w:rPr>
@@ -6994,6 +7066,7 @@
           <w:p>
             <w:pPr>
               <w:spacing w:after="0" w:before="0"/>
+              <w:jc w:val="left"/>
             </w:pPr>
             <w:r>
               <w:rPr>
@@ -7027,6 +7100,7 @@
           <w:p>
             <w:pPr>
               <w:spacing w:after="0" w:before="0"/>
+              <w:jc w:val="left"/>
             </w:pPr>
             <w:r>
               <w:rPr>
@@ -7077,6 +7151,7 @@
           <w:p>
             <w:pPr>
               <w:spacing w:after="0" w:before="0"/>
+              <w:jc w:val="left"/>
             </w:pPr>
             <w:r>
               <w:rPr>
@@ -7112,6 +7187,7 @@
           <w:p>
             <w:pPr>
               <w:spacing w:after="0" w:before="0"/>
+              <w:jc w:val="left"/>
             </w:pPr>
             <w:r>
               <w:rPr>
@@ -7145,6 +7221,7 @@
           <w:p>
             <w:pPr>
               <w:spacing w:after="0" w:before="0"/>
+              <w:jc w:val="left"/>
             </w:pPr>
             <w:r>
               <w:rPr>
@@ -7195,6 +7272,7 @@
           <w:p>
             <w:pPr>
               <w:spacing w:after="0" w:before="0"/>
+              <w:jc w:val="left"/>
             </w:pPr>
             <w:r>
               <w:rPr>
@@ -7230,6 +7308,7 @@
           <w:p>
             <w:pPr>
               <w:spacing w:after="0" w:before="0"/>
+              <w:jc w:val="left"/>
             </w:pPr>
             <w:r>
               <w:rPr>
@@ -7263,6 +7342,7 @@
           <w:p>
             <w:pPr>
               <w:spacing w:after="0" w:before="0"/>
+              <w:jc w:val="left"/>
             </w:pPr>
             <w:r>
               <w:rPr>
@@ -7314,9 +7394,9 @@
         <w:tblLayout w:type="fixed"/>
       </w:tblPr>
       <w:tblGrid>
-        <w:gridCol w:w="2208"/>
-        <w:gridCol w:w="7543"/>
-        <w:gridCol w:w="2921"/>
+        <w:gridCol w:w="1774"/>
+        <w:gridCol w:w="7857"/>
+        <w:gridCol w:w="3041"/>
       </w:tblGrid>
       <w:tr>
         <w:trPr>
@@ -7325,7 +7405,7 @@
         </w:trPr>
         <w:tc>
           <w:tcPr>
-            <w:tcW w:type="dxa" w:w="2208"/>
+            <w:tcW w:type="dxa" w:w="1774"/>
             <w:tcBorders>
               <w:top w:val="single" w:color="C9C7D6" w:sz="4"/>
               <w:left w:val="single" w:color="C9C7D6" w:sz="4"/>
@@ -7344,6 +7424,7 @@
           <w:p>
             <w:pPr>
               <w:spacing w:after="0" w:before="0"/>
+              <w:jc w:val="left"/>
             </w:pPr>
             <w:r>
               <w:rPr>
@@ -7360,7 +7441,7 @@
         </w:tc>
         <w:tc>
           <w:tcPr>
-            <w:tcW w:type="dxa" w:w="7543"/>
+            <w:tcW w:type="dxa" w:w="7857"/>
             <w:tcBorders>
               <w:top w:val="single" w:color="C9C7D6" w:sz="4"/>
               <w:left w:val="single" w:color="C9C7D6" w:sz="4"/>
@@ -7379,6 +7460,7 @@
           <w:p>
             <w:pPr>
               <w:spacing w:after="0" w:before="0"/>
+              <w:jc w:val="left"/>
             </w:pPr>
             <w:r>
               <w:rPr>
@@ -7395,7 +7477,7 @@
         </w:tc>
         <w:tc>
           <w:tcPr>
-            <w:tcW w:type="dxa" w:w="2921"/>
+            <w:tcW w:type="dxa" w:w="3041"/>
             <w:tcBorders>
               <w:top w:val="single" w:color="C9C7D6" w:sz="4"/>
               <w:left w:val="single" w:color="C9C7D6" w:sz="4"/>
@@ -7414,6 +7496,7 @@
           <w:p>
             <w:pPr>
               <w:spacing w:after="0" w:before="0"/>
+              <w:jc w:val="left"/>
             </w:pPr>
             <w:r>
               <w:rPr>
@@ -7436,7 +7519,7 @@
         </w:trPr>
         <w:tc>
           <w:tcPr>
-            <w:tcW w:type="dxa" w:w="2208"/>
+            <w:tcW w:type="dxa" w:w="1774"/>
             <w:tcBorders>
               <w:top w:val="single" w:color="C9C7D6" w:sz="4"/>
               <w:left w:val="single" w:color="C9C7D6" w:sz="4"/>
@@ -7455,6 +7538,7 @@
           <w:p>
             <w:pPr>
               <w:spacing w:after="0" w:before="0"/>
+              <w:jc w:val="left"/>
             </w:pPr>
             <w:r>
               <w:rPr>
@@ -7471,7 +7555,7 @@
         </w:tc>
         <w:tc>
           <w:tcPr>
-            <w:tcW w:type="dxa" w:w="7543"/>
+            <w:tcW w:type="dxa" w:w="7857"/>
             <w:tcBorders>
               <w:top w:val="single" w:color="C9C7D6" w:sz="4"/>
               <w:left w:val="single" w:color="C9C7D6" w:sz="4"/>
@@ -7490,6 +7574,7 @@
           <w:p>
             <w:pPr>
               <w:spacing w:after="0" w:before="0"/>
+              <w:jc w:val="left"/>
             </w:pPr>
             <w:r>
               <w:rPr>
@@ -7504,7 +7589,7 @@
         </w:tc>
         <w:tc>
           <w:tcPr>
-            <w:tcW w:type="dxa" w:w="2921"/>
+            <w:tcW w:type="dxa" w:w="3041"/>
             <w:tcBorders>
               <w:top w:val="single" w:color="C9C7D6" w:sz="4"/>
               <w:left w:val="single" w:color="C9C7D6" w:sz="4"/>
@@ -7523,6 +7608,7 @@
           <w:p>
             <w:pPr>
               <w:spacing w:after="0" w:before="0"/>
+              <w:jc w:val="left"/>
             </w:pPr>
             <w:r>
               <w:rPr>
@@ -7543,7 +7629,7 @@
         </w:trPr>
         <w:tc>
           <w:tcPr>
-            <w:tcW w:type="dxa" w:w="2208"/>
+            <w:tcW w:type="dxa" w:w="1774"/>
             <w:tcBorders>
               <w:top w:val="single" w:color="C9C7D6" w:sz="4"/>
               <w:left w:val="single" w:color="C9C7D6" w:sz="4"/>
@@ -7562,6 +7648,7 @@
           <w:p>
             <w:pPr>
               <w:spacing w:after="0" w:before="0"/>
+              <w:jc w:val="left"/>
             </w:pPr>
             <w:r>
               <w:rPr>
@@ -7578,7 +7665,7 @@
         </w:tc>
         <w:tc>
           <w:tcPr>
-            <w:tcW w:type="dxa" w:w="7543"/>
+            <w:tcW w:type="dxa" w:w="7857"/>
             <w:tcBorders>
               <w:top w:val="single" w:color="C9C7D6" w:sz="4"/>
               <w:left w:val="single" w:color="C9C7D6" w:sz="4"/>
@@ -7597,6 +7684,7 @@
           <w:p>
             <w:pPr>
               <w:spacing w:after="0" w:before="0"/>
+              <w:jc w:val="left"/>
             </w:pPr>
             <w:r>
               <w:rPr>
@@ -7611,7 +7699,7 @@
         </w:tc>
         <w:tc>
           <w:tcPr>
-            <w:tcW w:type="dxa" w:w="2921"/>
+            <w:tcW w:type="dxa" w:w="3041"/>
             <w:tcBorders>
               <w:top w:val="single" w:color="C9C7D6" w:sz="4"/>
               <w:left w:val="single" w:color="C9C7D6" w:sz="4"/>
@@ -7630,6 +7718,7 @@
           <w:p>
             <w:pPr>
               <w:spacing w:after="0" w:before="0"/>
+              <w:jc w:val="left"/>
             </w:pPr>
             <w:r>
               <w:rPr>
@@ -7650,7 +7739,7 @@
         </w:trPr>
         <w:tc>
           <w:tcPr>
-            <w:tcW w:type="dxa" w:w="2208"/>
+            <w:tcW w:type="dxa" w:w="1774"/>
             <w:tcBorders>
               <w:top w:val="single" w:color="C9C7D6" w:sz="4"/>
               <w:left w:val="single" w:color="C9C7D6" w:sz="4"/>
@@ -7669,6 +7758,7 @@
           <w:p>
             <w:pPr>
               <w:spacing w:after="0" w:before="0"/>
+              <w:jc w:val="left"/>
             </w:pPr>
             <w:r>
               <w:rPr>
@@ -7685,7 +7775,7 @@
         </w:tc>
         <w:tc>
           <w:tcPr>
-            <w:tcW w:type="dxa" w:w="7543"/>
+            <w:tcW w:type="dxa" w:w="7857"/>
             <w:tcBorders>
               <w:top w:val="single" w:color="C9C7D6" w:sz="4"/>
               <w:left w:val="single" w:color="C9C7D6" w:sz="4"/>
@@ -7704,6 +7794,7 @@
           <w:p>
             <w:pPr>
               <w:spacing w:after="0" w:before="0"/>
+              <w:jc w:val="left"/>
             </w:pPr>
             <w:r>
               <w:rPr>
@@ -7718,7 +7809,7 @@
         </w:tc>
         <w:tc>
           <w:tcPr>
-            <w:tcW w:type="dxa" w:w="2921"/>
+            <w:tcW w:type="dxa" w:w="3041"/>
             <w:tcBorders>
               <w:top w:val="single" w:color="C9C7D6" w:sz="4"/>
               <w:left w:val="single" w:color="C9C7D6" w:sz="4"/>
@@ -7737,6 +7828,7 @@
           <w:p>
             <w:pPr>
               <w:spacing w:after="0" w:before="0"/>
+              <w:jc w:val="left"/>
             </w:pPr>
             <w:r>
               <w:rPr>
@@ -7757,7 +7849,7 @@
         </w:trPr>
         <w:tc>
           <w:tcPr>
-            <w:tcW w:type="dxa" w:w="2208"/>
+            <w:tcW w:type="dxa" w:w="1774"/>
             <w:tcBorders>
               <w:top w:val="single" w:color="C9C7D6" w:sz="4"/>
               <w:left w:val="single" w:color="C9C7D6" w:sz="4"/>
@@ -7776,6 +7868,7 @@
           <w:p>
             <w:pPr>
               <w:spacing w:after="0" w:before="0"/>
+              <w:jc w:val="left"/>
             </w:pPr>
             <w:r>
               <w:rPr>
@@ -7792,7 +7885,7 @@
         </w:tc>
         <w:tc>
           <w:tcPr>
-            <w:tcW w:type="dxa" w:w="7543"/>
+            <w:tcW w:type="dxa" w:w="7857"/>
             <w:tcBorders>
               <w:top w:val="single" w:color="C9C7D6" w:sz="4"/>
               <w:left w:val="single" w:color="C9C7D6" w:sz="4"/>
@@ -7811,6 +7904,7 @@
           <w:p>
             <w:pPr>
               <w:spacing w:after="0" w:before="0"/>
+              <w:jc w:val="left"/>
             </w:pPr>
             <w:r>
               <w:rPr>
@@ -7825,7 +7919,7 @@
         </w:tc>
         <w:tc>
           <w:tcPr>
-            <w:tcW w:type="dxa" w:w="2921"/>
+            <w:tcW w:type="dxa" w:w="3041"/>
             <w:tcBorders>
               <w:top w:val="single" w:color="C9C7D6" w:sz="4"/>
               <w:left w:val="single" w:color="C9C7D6" w:sz="4"/>
@@ -7844,6 +7938,7 @@
           <w:p>
             <w:pPr>
               <w:spacing w:after="0" w:before="0"/>
+              <w:jc w:val="left"/>
             </w:pPr>
             <w:r>
               <w:rPr>
@@ -8021,9 +8116,9 @@
         <w:tblLayout w:type="fixed"/>
       </w:tblPr>
       <w:tblGrid>
-        <w:gridCol w:w="2214"/>
-        <w:gridCol w:w="8580"/>
-        <w:gridCol w:w="1878"/>
+        <w:gridCol w:w="1810"/>
+        <w:gridCol w:w="8912"/>
+        <w:gridCol w:w="1950"/>
       </w:tblGrid>
       <w:tr>
         <w:trPr>
@@ -8032,7 +8127,7 @@
         </w:trPr>
         <w:tc>
           <w:tcPr>
-            <w:tcW w:type="dxa" w:w="2214"/>
+            <w:tcW w:type="dxa" w:w="1810"/>
             <w:tcBorders>
               <w:top w:val="single" w:color="C9C7D6" w:sz="4"/>
               <w:left w:val="single" w:color="C9C7D6" w:sz="4"/>
@@ -8051,6 +8146,7 @@
           <w:p>
             <w:pPr>
               <w:spacing w:after="0" w:before="0"/>
+              <w:jc w:val="left"/>
             </w:pPr>
             <w:r>
               <w:rPr>
@@ -8067,7 +8163,7 @@
         </w:tc>
         <w:tc>
           <w:tcPr>
-            <w:tcW w:type="dxa" w:w="8580"/>
+            <w:tcW w:type="dxa" w:w="8912"/>
             <w:tcBorders>
               <w:top w:val="single" w:color="C9C7D6" w:sz="4"/>
               <w:left w:val="single" w:color="C9C7D6" w:sz="4"/>
@@ -8086,6 +8182,7 @@
           <w:p>
             <w:pPr>
               <w:spacing w:after="0" w:before="0"/>
+              <w:jc w:val="left"/>
             </w:pPr>
             <w:r>
               <w:rPr>
@@ -8102,7 +8199,7 @@
         </w:tc>
         <w:tc>
           <w:tcPr>
-            <w:tcW w:type="dxa" w:w="1878"/>
+            <w:tcW w:type="dxa" w:w="1950"/>
             <w:tcBorders>
               <w:top w:val="single" w:color="C9C7D6" w:sz="4"/>
               <w:left w:val="single" w:color="C9C7D6" w:sz="4"/>
@@ -8121,6 +8218,7 @@
           <w:p>
             <w:pPr>
               <w:spacing w:after="0" w:before="0"/>
+              <w:jc w:val="left"/>
             </w:pPr>
             <w:r>
               <w:rPr>
@@ -8143,7 +8241,7 @@
         </w:trPr>
         <w:tc>
           <w:tcPr>
-            <w:tcW w:type="dxa" w:w="2214"/>
+            <w:tcW w:type="dxa" w:w="1810"/>
             <w:tcBorders>
               <w:top w:val="single" w:color="C9C7D6" w:sz="4"/>
               <w:left w:val="single" w:color="C9C7D6" w:sz="4"/>
@@ -8162,6 +8260,7 @@
           <w:p>
             <w:pPr>
               <w:spacing w:after="0" w:before="0"/>
+              <w:jc w:val="left"/>
             </w:pPr>
             <w:r>
               <w:rPr>
@@ -8178,7 +8277,7 @@
         </w:tc>
         <w:tc>
           <w:tcPr>
-            <w:tcW w:type="dxa" w:w="8580"/>
+            <w:tcW w:type="dxa" w:w="8912"/>
             <w:tcBorders>
               <w:top w:val="single" w:color="C9C7D6" w:sz="4"/>
               <w:left w:val="single" w:color="C9C7D6" w:sz="4"/>
@@ -8197,6 +8296,7 @@
           <w:p>
             <w:pPr>
               <w:spacing w:after="0" w:before="0"/>
+              <w:jc w:val="left"/>
             </w:pPr>
             <w:r>
               <w:rPr>
@@ -8211,7 +8311,7 @@
         </w:tc>
         <w:tc>
           <w:tcPr>
-            <w:tcW w:type="dxa" w:w="1878"/>
+            <w:tcW w:type="dxa" w:w="1950"/>
             <w:tcBorders>
               <w:top w:val="single" w:color="C9C7D6" w:sz="4"/>
               <w:left w:val="single" w:color="C9C7D6" w:sz="4"/>
@@ -8230,6 +8330,7 @@
           <w:p>
             <w:pPr>
               <w:spacing w:after="0" w:before="0"/>
+              <w:jc w:val="left"/>
             </w:pPr>
             <w:r>
               <w:rPr>
@@ -8250,7 +8351,7 @@
         </w:trPr>
         <w:tc>
           <w:tcPr>
-            <w:tcW w:type="dxa" w:w="2214"/>
+            <w:tcW w:type="dxa" w:w="1810"/>
             <w:tcBorders>
               <w:top w:val="single" w:color="C9C7D6" w:sz="4"/>
               <w:left w:val="single" w:color="C9C7D6" w:sz="4"/>
@@ -8269,6 +8370,7 @@
           <w:p>
             <w:pPr>
               <w:spacing w:after="0" w:before="0"/>
+              <w:jc w:val="left"/>
             </w:pPr>
             <w:r>
               <w:rPr>
@@ -8285,7 +8387,7 @@
         </w:tc>
         <w:tc>
           <w:tcPr>
-            <w:tcW w:type="dxa" w:w="8580"/>
+            <w:tcW w:type="dxa" w:w="8912"/>
             <w:tcBorders>
               <w:top w:val="single" w:color="C9C7D6" w:sz="4"/>
               <w:left w:val="single" w:color="C9C7D6" w:sz="4"/>
@@ -8304,6 +8406,7 @@
           <w:p>
             <w:pPr>
               <w:spacing w:after="0" w:before="0"/>
+              <w:jc w:val="left"/>
             </w:pPr>
             <w:r>
               <w:rPr>
@@ -8318,7 +8421,7 @@
         </w:tc>
         <w:tc>
           <w:tcPr>
-            <w:tcW w:type="dxa" w:w="1878"/>
+            <w:tcW w:type="dxa" w:w="1950"/>
             <w:tcBorders>
               <w:top w:val="single" w:color="C9C7D6" w:sz="4"/>
               <w:left w:val="single" w:color="C9C7D6" w:sz="4"/>
@@ -8337,6 +8440,7 @@
           <w:p>
             <w:pPr>
               <w:spacing w:after="0" w:before="0"/>
+              <w:jc w:val="left"/>
             </w:pPr>
             <w:r>
               <w:rPr>
@@ -8357,7 +8461,7 @@
         </w:trPr>
         <w:tc>
           <w:tcPr>
-            <w:tcW w:type="dxa" w:w="2214"/>
+            <w:tcW w:type="dxa" w:w="1810"/>
             <w:tcBorders>
               <w:top w:val="single" w:color="C9C7D6" w:sz="4"/>
               <w:left w:val="single" w:color="C9C7D6" w:sz="4"/>
@@ -8376,6 +8480,7 @@
           <w:p>
             <w:pPr>
               <w:spacing w:after="0" w:before="0"/>
+              <w:jc w:val="left"/>
             </w:pPr>
             <w:r>
               <w:rPr>
@@ -8392,7 +8497,7 @@
         </w:tc>
         <w:tc>
           <w:tcPr>
-            <w:tcW w:type="dxa" w:w="8580"/>
+            <w:tcW w:type="dxa" w:w="8912"/>
             <w:tcBorders>
               <w:top w:val="single" w:color="C9C7D6" w:sz="4"/>
               <w:left w:val="single" w:color="C9C7D6" w:sz="4"/>
@@ -8411,6 +8516,7 @@
           <w:p>
             <w:pPr>
               <w:spacing w:after="0" w:before="0"/>
+              <w:jc w:val="left"/>
             </w:pPr>
             <w:r>
               <w:rPr>
@@ -8425,7 +8531,7 @@
         </w:tc>
         <w:tc>
           <w:tcPr>
-            <w:tcW w:type="dxa" w:w="1878"/>
+            <w:tcW w:type="dxa" w:w="1950"/>
             <w:tcBorders>
               <w:top w:val="single" w:color="C9C7D6" w:sz="4"/>
               <w:left w:val="single" w:color="C9C7D6" w:sz="4"/>
@@ -8444,6 +8550,7 @@
           <w:p>
             <w:pPr>
               <w:spacing w:after="0" w:before="0"/>
+              <w:jc w:val="left"/>
             </w:pPr>
             <w:r>
               <w:rPr>
@@ -8464,7 +8571,7 @@
         </w:trPr>
         <w:tc>
           <w:tcPr>
-            <w:tcW w:type="dxa" w:w="2214"/>
+            <w:tcW w:type="dxa" w:w="1810"/>
             <w:tcBorders>
               <w:top w:val="single" w:color="C9C7D6" w:sz="4"/>
               <w:left w:val="single" w:color="C9C7D6" w:sz="4"/>
@@ -8483,6 +8590,7 @@
           <w:p>
             <w:pPr>
               <w:spacing w:after="0" w:before="0"/>
+              <w:jc w:val="left"/>
             </w:pPr>
             <w:r>
               <w:rPr>
@@ -8499,7 +8607,7 @@
         </w:tc>
         <w:tc>
           <w:tcPr>
-            <w:tcW w:type="dxa" w:w="8580"/>
+            <w:tcW w:type="dxa" w:w="8912"/>
             <w:tcBorders>
               <w:top w:val="single" w:color="C9C7D6" w:sz="4"/>
               <w:left w:val="single" w:color="C9C7D6" w:sz="4"/>
@@ -8518,6 +8626,7 @@
           <w:p>
             <w:pPr>
               <w:spacing w:after="0" w:before="0"/>
+              <w:jc w:val="left"/>
             </w:pPr>
             <w:r>
               <w:rPr>
@@ -8532,7 +8641,7 @@
         </w:tc>
         <w:tc>
           <w:tcPr>
-            <w:tcW w:type="dxa" w:w="1878"/>
+            <w:tcW w:type="dxa" w:w="1950"/>
             <w:tcBorders>
               <w:top w:val="single" w:color="C9C7D6" w:sz="4"/>
               <w:left w:val="single" w:color="C9C7D6" w:sz="4"/>
@@ -8551,6 +8660,7 @@
           <w:p>
             <w:pPr>
               <w:spacing w:after="0" w:before="0"/>
+              <w:jc w:val="left"/>
             </w:pPr>
             <w:r>
               <w:rPr>

</xml_diff>